<commit_message>
docs: refresh desktop screenshots and demo guide
</commit_message>
<xml_diff>
--- a/artifacts/Data_Mover_Demo_Screenshots_v1.docx
+++ b/artifacts/Data_Mover_Demo_Screenshots_v1.docx
@@ -82,7 +82,7 @@
           <w:color w:val="55606E"/>
           <w:sz w:val="20"/>
         </w:rPr>
-        <w:t>Version 1  ·  Demo environment  ·  August 18, 2026</w:t>
+        <w:t>Version 1  ·  Demo environment  ·  September 18, 2026</w:t>
       </w:r>
     </w:p>
     <w:p>
@@ -249,7 +249,7 @@
       <w:r>
         <w:drawing>
           <wp:inline xmlns:a="http://schemas.openxmlformats.org/drawingml/2006/main" xmlns:pic="http://schemas.openxmlformats.org/drawingml/2006/picture">
-            <wp:extent cx="7033517" cy="4709159"/>
+            <wp:extent cx="6849687" cy="4709160"/>
             <wp:docPr id="2" name="Picture 2" descr="Data Mover screenshot: 2. Request access" title="2. Request access"/>
             <wp:cNvGraphicFramePr>
               <a:graphicFrameLocks noChangeAspect="1"/>
@@ -270,7 +270,7 @@
                   <pic:spPr>
                     <a:xfrm>
                       <a:off x="0" y="0"/>
-                      <a:ext cx="7033517" cy="4709159"/>
+                      <a:ext cx="6849687" cy="4709160"/>
                     </a:xfrm>
                     <a:prstGeom prst="rect"/>
                   </pic:spPr>
@@ -347,7 +347,7 @@
       <w:r>
         <w:drawing>
           <wp:inline xmlns:a="http://schemas.openxmlformats.org/drawingml/2006/main" xmlns:pic="http://schemas.openxmlformats.org/drawingml/2006/picture">
-            <wp:extent cx="7033517" cy="4709159"/>
+            <wp:extent cx="6849687" cy="4709160"/>
             <wp:docPr id="3" name="Picture 3" descr="Data Mover screenshot: 3. Password recovery" title="3. Password recovery"/>
             <wp:cNvGraphicFramePr>
               <a:graphicFrameLocks noChangeAspect="1"/>
@@ -368,7 +368,7 @@
                   <pic:spPr>
                     <a:xfrm>
                       <a:off x="0" y="0"/>
-                      <a:ext cx="7033517" cy="4709159"/>
+                      <a:ext cx="6849687" cy="4709160"/>
                     </a:xfrm>
                     <a:prstGeom prst="rect"/>
                   </pic:spPr>
@@ -445,7 +445,7 @@
       <w:r>
         <w:drawing>
           <wp:inline xmlns:a="http://schemas.openxmlformats.org/drawingml/2006/main" xmlns:pic="http://schemas.openxmlformats.org/drawingml/2006/picture">
-            <wp:extent cx="5652654" cy="3886200"/>
+            <wp:extent cx="5650624" cy="3886200"/>
             <wp:docPr id="4" name="Picture 4" descr="Data Mover screenshot: 4. Pipeline builder" title="4. Pipeline builder"/>
             <wp:cNvGraphicFramePr>
               <a:graphicFrameLocks noChangeAspect="1"/>
@@ -466,7 +466,7 @@
                   <pic:spPr>
                     <a:xfrm>
                       <a:off x="0" y="0"/>
-                      <a:ext cx="5652654" cy="3886200"/>
+                      <a:ext cx="5650624" cy="3886200"/>
                     </a:xfrm>
                     <a:prstGeom prst="rect"/>
                   </pic:spPr>
@@ -489,9 +489,9 @@
           <w:color w:val="55606E"/>
           <w:sz w:val="18"/>
         </w:rPr>
-        <w:t>Sources currently mocked: CSV uploads, Advana (Databricks), MSS (Palantir Foundry), PostgreSQL (ADE), and MongoDB (ADE).</w:t>
+        <w:t>Sources currently mocked in demo mode: CSV uploads, MSS (Palantir Foundry), and PostgreSQL.</w:t>
         <w:br/>
-        <w:t>Destinations currently mocked: Advana, MSS, PostgreSQL (ADE), and MongoDB (ADE).</w:t>
+        <w:t>Destinations currently mocked in demo mode: MSS, MCS-COP, and PostgreSQL.</w:t>
         <w:br/>
         <w:t>Planned implementation: replace synthetic catalogs, validation results, and transfer telemetry with live, secured connectors for these platforms, and add MCS as a supported connection.</w:t>
       </w:r>
@@ -562,7 +562,7 @@
       <w:r>
         <w:drawing>
           <wp:inline xmlns:a="http://schemas.openxmlformats.org/drawingml/2006/main" xmlns:pic="http://schemas.openxmlformats.org/drawingml/2006/picture">
-            <wp:extent cx="7534656" cy="4709160"/>
+            <wp:extent cx="7531941" cy="4709160"/>
             <wp:docPr id="5" name="Picture 5" descr="Data Mover screenshot: 5. Connections" title="5. Connections"/>
             <wp:cNvGraphicFramePr>
               <a:graphicFrameLocks noChangeAspect="1"/>
@@ -583,7 +583,7 @@
                   <pic:spPr>
                     <a:xfrm>
                       <a:off x="0" y="0"/>
-                      <a:ext cx="7534656" cy="4709160"/>
+                      <a:ext cx="7531941" cy="4709160"/>
                     </a:xfrm>
                     <a:prstGeom prst="rect"/>
                   </pic:spPr>
@@ -758,7 +758,7 @@
       <w:r>
         <w:drawing>
           <wp:inline xmlns:a="http://schemas.openxmlformats.org/drawingml/2006/main" xmlns:pic="http://schemas.openxmlformats.org/drawingml/2006/picture">
-            <wp:extent cx="6849687" cy="4709160"/>
+            <wp:extent cx="6769417" cy="4709160"/>
             <wp:docPr id="7" name="Picture 7" descr="Data Mover screenshot: 7. Users and invitations" title="7. Users and invitations"/>
             <wp:cNvGraphicFramePr>
               <a:graphicFrameLocks noChangeAspect="1"/>
@@ -779,7 +779,7 @@
                   <pic:spPr>
                     <a:xfrm>
                       <a:off x="0" y="0"/>
-                      <a:ext cx="6849687" cy="4709160"/>
+                      <a:ext cx="6769417" cy="4709160"/>
                     </a:xfrm>
                     <a:prstGeom prst="rect"/>
                   </pic:spPr>

</xml_diff>

<commit_message>
Refresh Hedron UI and documentation screenshots
</commit_message>
<xml_diff>
--- a/artifacts/Data_Mover_Demo_Screenshots_v1.docx
+++ b/artifacts/Data_Mover_Demo_Screenshots_v1.docx
@@ -660,7 +660,7 @@
       <w:r>
         <w:drawing>
           <wp:inline xmlns:a="http://schemas.openxmlformats.org/drawingml/2006/main" xmlns:pic="http://schemas.openxmlformats.org/drawingml/2006/picture">
-            <wp:extent cx="6849687" cy="4709160"/>
+            <wp:extent cx="6769417" cy="4709160"/>
             <wp:docPr id="6" name="Picture 6" descr="Data Mover screenshot: 6. Account settings" title="6. Account settings"/>
             <wp:cNvGraphicFramePr>
               <a:graphicFrameLocks noChangeAspect="1"/>
@@ -681,7 +681,7 @@
                   <pic:spPr>
                     <a:xfrm>
                       <a:off x="0" y="0"/>
-                      <a:ext cx="6849687" cy="4709160"/>
+                      <a:ext cx="6769417" cy="4709160"/>
                     </a:xfrm>
                     <a:prstGeom prst="rect"/>
                   </pic:spPr>
@@ -856,7 +856,7 @@
       <w:r>
         <w:drawing>
           <wp:inline xmlns:a="http://schemas.openxmlformats.org/drawingml/2006/main" xmlns:pic="http://schemas.openxmlformats.org/drawingml/2006/picture">
-            <wp:extent cx="6849687" cy="4709160"/>
+            <wp:extent cx="6769417" cy="4709160"/>
             <wp:docPr id="8" name="Picture 8" descr="Data Mover screenshot: 8. Audit activity" title="8. Audit activity"/>
             <wp:cNvGraphicFramePr>
               <a:graphicFrameLocks noChangeAspect="1"/>
@@ -877,7 +877,7 @@
                   <pic:spPr>
                     <a:xfrm>
                       <a:off x="0" y="0"/>
-                      <a:ext cx="6849687" cy="4709160"/>
+                      <a:ext cx="6769417" cy="4709160"/>
                     </a:xfrm>
                     <a:prstGeom prst="rect"/>
                   </pic:spPr>

</xml_diff>

<commit_message>
Refresh user feedback UI and documentation screenshots
</commit_message>
<xml_diff>
--- a/artifacts/Data_Mover_Demo_Screenshots_v1.docx
+++ b/artifacts/Data_Mover_Demo_Screenshots_v1.docx
@@ -82,7 +82,7 @@
           <w:color w:val="55606E"/>
           <w:sz w:val="20"/>
         </w:rPr>
-        <w:t>Version 1  ·  Demo environment  ·  September 18, 2026</w:t>
+        <w:t>Version 1  ·  Demo environment  ·  September 22, 2026</w:t>
       </w:r>
     </w:p>
     <w:p>
@@ -445,7 +445,7 @@
       <w:r>
         <w:drawing>
           <wp:inline xmlns:a="http://schemas.openxmlformats.org/drawingml/2006/main" xmlns:pic="http://schemas.openxmlformats.org/drawingml/2006/picture">
-            <wp:extent cx="5650624" cy="3886200"/>
+            <wp:extent cx="5586412" cy="3886200"/>
             <wp:docPr id="4" name="Picture 4" descr="Data Mover screenshot: 4. Pipeline builder" title="4. Pipeline builder"/>
             <wp:cNvGraphicFramePr>
               <a:graphicFrameLocks noChangeAspect="1"/>
@@ -466,7 +466,7 @@
                   <pic:spPr>
                     <a:xfrm>
                       <a:off x="0" y="0"/>
-                      <a:ext cx="5650624" cy="3886200"/>
+                      <a:ext cx="5586412" cy="3886200"/>
                     </a:xfrm>
                     <a:prstGeom prst="rect"/>
                   </pic:spPr>
@@ -562,7 +562,7 @@
       <w:r>
         <w:drawing>
           <wp:inline xmlns:a="http://schemas.openxmlformats.org/drawingml/2006/main" xmlns:pic="http://schemas.openxmlformats.org/drawingml/2006/picture">
-            <wp:extent cx="7531941" cy="4709160"/>
+            <wp:extent cx="3755149" cy="4709160"/>
             <wp:docPr id="5" name="Picture 5" descr="Data Mover screenshot: 5. Connections" title="5. Connections"/>
             <wp:cNvGraphicFramePr>
               <a:graphicFrameLocks noChangeAspect="1"/>
@@ -583,7 +583,7 @@
                   <pic:spPr>
                     <a:xfrm>
                       <a:off x="0" y="0"/>
-                      <a:ext cx="7531941" cy="4709160"/>
+                      <a:ext cx="3755149" cy="4709160"/>
                     </a:xfrm>
                     <a:prstGeom prst="rect"/>
                   </pic:spPr>

</xml_diff>